<commit_message>
Update system documentation and add Deployment & Connectivity Word guide
</commit_message>
<xml_diff>
--- a/Hear2Lead_System_Development_Flow.docx
+++ b/Hear2Lead_System_Development_Flow.docx
@@ -75,7 +75,7 @@
         <w:t xml:space="preserve">Backend &amp; Database Layer: </w:t>
       </w:r>
       <w:r>
-        <w:t xml:space="preserve">Native PHP 8+ using PDO (PHP Data Objects) with prepared statements and MySQL/MariaDB (student_leadership_db). Includes automatic database creation, schema migration, seed initialization, and real-time overdue task synchronization (syncOverdueTasks) in config/db.php.</w:t>
+        <w:t xml:space="preserve">Native PHP 8+ using PDO with Dual-Database support: Local MySQL/MariaDB (student_leadership_db) for XAMPP and Cloud Supabase PostgreSQL via SupabaseCompatPDO and DatabaseSessionHandler for Vercel Serverless deployment. Includes automatic database creation, schema migration, seed initialization, and real-time overdue task synchronization (syncOverdueTasks) in config/db.php.</w:t>
       </w:r>
     </w:p>
     <w:p>
@@ -666,7 +666,7 @@
               <w:t xml:space="preserve">User &amp; Role Management (leadership/users.php): </w:t>
             </w:r>
             <w:r>
-              <w:t xml:space="preserve">3-tab module for managing Officers/Leaders, Student Account Approvals, and the Dynamic Role Library (user_roles).</w:t>
+              <w:t xml:space="preserve">4-tab module for managing Officers/Leaders, Admin-Only Student Account Approvals, Admin-Only Dynamic Role Library (user_roles), and Admin-Only Password Reset Tickets (password_reset_tickets).</w:t>
             </w:r>
           </w:p>
           <w:p>
@@ -5369,6 +5369,121 @@
         </w:tc>
       </w:tr>
     </w:tbl>
+    <w:p>
+      <w:pPr>
+        <w:pStyle w:val="Heading1"/>
+        <w:spacing w:before="260" w:after="120" w:line="276" w:lineRule="auto"/>
+      </w:pPr>
+      <w:r>
+        <w:rPr>
+          <w:b/>
+          <w:color w:val="641914"/>
+          <w:sz w:val="28"/>
+          <w:szCs w:val="28"/>
+        </w:rPr>
+        <w:t xml:space="preserve">8. Password Reset Tickets, Header Password Change &amp; Cloud Deployment (Vercel + Supabase)</w:t>
+      </w:r>
+    </w:p>
+    <w:p>
+      <w:pPr>
+        <w:numPr>
+          <w:ilvl w:val="0"/>
+          <w:numId w:val="1"/>
+        </w:numPr>
+        <w:spacing w:before="60" w:after="60" w:line="276" w:lineRule="auto"/>
+      </w:pPr>
+      <w:r>
+        <w:rPr>
+          <w:b/>
+          <w:color w:val="641914"/>
+          <w:sz w:val="21"/>
+          <w:szCs w:val="21"/>
+        </w:rPr>
+        <w:t xml:space="preserve">Forgot Password Ticket Workflow (includes/forgot_password_handler.php): </w:t>
+      </w:r>
+      <w:r>
+        <w:rPr>
+          <w:sz w:val="21"/>
+          <w:szCs w:val="21"/>
+        </w:rPr>
+        <w:t xml:space="preserve">Allows students (LRN/Email) and officers (Username/Email) to submit CAPTCHA-verified password reset requests stored in password_reset_tickets, confirmed via a top-layer SweetAlert2 dialog (z-index: 999999), and resolved exclusively by Administrators in leadership/users.php.</w:t>
+      </w:r>
+    </w:p>
+    <w:p>
+      <w:pPr>
+        <w:numPr>
+          <w:ilvl w:val="0"/>
+          <w:numId w:val="1"/>
+        </w:numPr>
+        <w:spacing w:before="60" w:after="60" w:line="276" w:lineRule="auto"/>
+      </w:pPr>
+      <w:r>
+        <w:rPr>
+          <w:b/>
+          <w:color w:val="641914"/>
+          <w:sz w:val="21"/>
+          <w:szCs w:val="21"/>
+        </w:rPr>
+        <w:t xml:space="preserve">Header Change Password Modal (includes/change_password_modal.php): </w:t>
+      </w:r>
+      <w:r>
+        <w:rPr>
+          <w:sz w:val="21"/>
+          <w:szCs w:val="21"/>
+        </w:rPr>
+        <w:t xml:space="preserve">Allows logged-in students and officers to change their own password from the profile dropdown with current password verification and 8+ character policy enforcement.</w:t>
+      </w:r>
+    </w:p>
+    <w:p>
+      <w:pPr>
+        <w:numPr>
+          <w:ilvl w:val="0"/>
+          <w:numId w:val="1"/>
+        </w:numPr>
+        <w:spacing w:before="60" w:after="60" w:line="276" w:lineRule="auto"/>
+      </w:pPr>
+      <w:r>
+        <w:rPr>
+          <w:b/>
+          <w:color w:val="641914"/>
+          <w:sz w:val="21"/>
+          <w:szCs w:val="21"/>
+        </w:rPr>
+        <w:t xml:space="preserve">Admin-Only Student Accounts Tab: </w:t>
+      </w:r>
+      <w:r>
+        <w:rPr>
+          <w:sz w:val="21"/>
+          <w:szCs w:val="21"/>
+        </w:rPr>
+        <w:t xml:space="preserve">Restricts visibility and backend queries of the Student Accounts tab in leadership/users.php exclusively to Administrators ($is_admin).</w:t>
+      </w:r>
+    </w:p>
+    <w:p>
+      <w:pPr>
+        <w:numPr>
+          <w:ilvl w:val="0"/>
+          <w:numId w:val="1"/>
+        </w:numPr>
+        <w:spacing w:before="60" w:after="60" w:line="276" w:lineRule="auto"/>
+      </w:pPr>
+      <w:r>
+        <w:rPr>
+          <w:b/>
+          <w:color w:val="641914"/>
+          <w:sz w:val="21"/>
+          <w:szCs w:val="21"/>
+        </w:rPr>
+        <w:t xml:space="preserve">Dual Deployment Connectivity (Local XAMPP &amp; Live Vercel + Supabase): </w:t>
+      </w:r>
+      <w:r>
+        <w:rPr>
+          <w:sz w:val="21"/>
+          <w:szCs w:val="21"/>
+        </w:rPr>
+        <w:t xml:space="preserve">Uses vercel.json and api/index.php for Vercel Serverless PHP (vercel-php@0.7.3) routing, SupabaseCompatPDO in config/db.php for automatic MySQL-to-PostgreSQL translation, DatabaseSessionHandler (user_sessions) for serverless session persistence, and dual-remote Git push (benejr27/Hear2Lead-1 + tomandjerrynolastname-byte/Hear2Lead) for automatic deployment to https://hear2lead-live.vercel.app/.</w:t>
+      </w:r>
+    </w:p>
     <w:sectPr>
       <w:pgSz w:w="11906" w:h="16838"/>
       <w:pgMar w:top="1134" w:right="1134" w:bottom="1134" w:left="1134" w:header="708" w:footer="708" w:gutter="0"/>

</xml_diff>